<commit_message>
Chapter 01 Finall review
</commit_message>
<xml_diff>
--- a/chapter-01_The Rise of Agentic AI in Cybersecurity/Agentic_Chapter01_RC2.docx
+++ b/chapter-01_The Rise of Agentic AI in Cybersecurity/Agentic_Chapter01_RC2.docx
@@ -215,42 +215,87 @@
             </w:rPr>
             <m:t>=</m:t>
           </m:r>
-          <m:r>
-            <m:rPr>
-              <m:sty m:val="p"/>
-            </m:rPr>
-            <w:rPr>
-              <w:rFonts w:ascii="Cambria Math" w:hAnsi="Cambria Math"/>
-              <w:sz w:val="24"/>
-              <w:szCs w:val="24"/>
-              <w:lang w:val="en-US"/>
-            </w:rPr>
-            <m:t>arg</m:t>
-          </m:r>
-          <m:r>
-            <w:rPr>
-              <w:rFonts w:ascii="Cambria Math" w:hAnsi="Cambria Math"/>
-              <w:sz w:val="24"/>
-              <w:szCs w:val="24"/>
-              <w:lang w:val="en-US"/>
-            </w:rPr>
-            <m:t>⁡</m:t>
-          </m:r>
-          <m:limLow>
-            <m:limLowPr>
+          <m:func>
+            <m:funcPr>
               <m:ctrlPr>
+                <w:rPr>
+                  <w:rFonts w:ascii="Cambria Math" w:hAnsi="Cambria Math"/>
+                  <w:i/>
+                  <w:sz w:val="24"/>
+                  <w:szCs w:val="24"/>
+                  <w:lang w:val="en-US"/>
+                </w:rPr>
+              </m:ctrlPr>
+            </m:funcPr>
+            <m:fName>
+              <m:r>
+                <m:rPr>
+                  <m:sty m:val="p"/>
+                </m:rPr>
                 <w:rPr>
                   <w:rFonts w:ascii="Cambria Math" w:hAnsi="Cambria Math"/>
                   <w:sz w:val="24"/>
                   <w:szCs w:val="24"/>
                   <w:lang w:val="en-US"/>
                 </w:rPr>
-              </m:ctrlPr>
-            </m:limLowPr>
+                <m:t>arg</m:t>
+              </m:r>
+            </m:fName>
             <m:e>
+              <m:limLow>
+                <m:limLowPr>
+                  <m:ctrlPr>
+                    <w:rPr>
+                      <w:rFonts w:ascii="Cambria Math" w:hAnsi="Cambria Math"/>
+                      <w:i/>
+                      <w:sz w:val="24"/>
+                      <w:szCs w:val="24"/>
+                      <w:lang w:val="en-US"/>
+                    </w:rPr>
+                  </m:ctrlPr>
+                </m:limLowPr>
+                <m:e>
+                  <m:func>
+                    <m:funcPr>
+                      <m:ctrlPr>
+                        <w:rPr>
+                          <w:rFonts w:ascii="Cambria Math" w:hAnsi="Cambria Math"/>
+                          <w:i/>
+                          <w:sz w:val="24"/>
+                          <w:szCs w:val="24"/>
+                          <w:lang w:val="en-US"/>
+                        </w:rPr>
+                      </m:ctrlPr>
+                    </m:funcPr>
+                    <m:fName>
+                      <m:r>
+                        <w:rPr>
+                          <w:rFonts w:ascii="Cambria Math" w:hAnsi="Cambria Math"/>
+                          <w:sz w:val="24"/>
+                          <w:szCs w:val="24"/>
+                          <w:lang w:val="en-US"/>
+                        </w:rPr>
+                        <m:t>min</m:t>
+                      </m:r>
+                    </m:fName>
+                    <m:e/>
+                  </m:func>
+                </m:e>
+                <m:lim>
+                  <m:r>
+                    <w:rPr>
+                      <w:rFonts w:ascii="Cambria Math" w:hAnsi="Cambria Math"/>
+                      <w:sz w:val="24"/>
+                      <w:szCs w:val="24"/>
+                      <w:lang w:val="en-US"/>
+                    </w:rPr>
+                    <m:t>π∈Π</m:t>
+                  </m:r>
+                </m:lim>
+              </m:limLow>
               <m:r>
                 <m:rPr>
-                  <m:sty m:val="p"/>
+                  <m:scr m:val="double-struck"/>
                 </m:rPr>
                 <w:rPr>
                   <w:rFonts w:ascii="Cambria Math" w:hAnsi="Cambria Math"/>
@@ -258,64 +303,60 @@
                   <w:szCs w:val="24"/>
                   <w:lang w:val="en-US"/>
                 </w:rPr>
-                <m:t>min</m:t>
+                <m:t>E</m:t>
               </m:r>
-              <m:r>
-                <w:rPr>
-                  <w:rFonts w:ascii="Cambria Math" w:hAnsi="Cambria Math"/>
-                  <w:sz w:val="24"/>
-                  <w:szCs w:val="24"/>
-                  <w:lang w:val="en-US"/>
-                </w:rPr>
-                <m:t>⁡</m:t>
-              </m:r>
+              <m:d>
+                <m:dPr>
+                  <m:begChr m:val="["/>
+                  <m:endChr m:val="]"/>
+                  <m:ctrlPr>
+                    <w:rPr>
+                      <w:rFonts w:ascii="Cambria Math" w:hAnsi="Cambria Math"/>
+                      <w:i/>
+                      <w:sz w:val="24"/>
+                      <w:szCs w:val="24"/>
+                      <w:lang w:val="en-US"/>
+                    </w:rPr>
+                  </m:ctrlPr>
+                </m:dPr>
+                <m:e>
+                  <m:r>
+                    <w:rPr>
+                      <w:rFonts w:ascii="Cambria Math" w:hAnsi="Cambria Math"/>
+                      <w:sz w:val="24"/>
+                      <w:szCs w:val="24"/>
+                      <w:lang w:val="en-US"/>
+                    </w:rPr>
+                    <m:t>L</m:t>
+                  </m:r>
+                  <m:d>
+                    <m:dPr>
+                      <m:ctrlPr>
+                        <w:rPr>
+                          <w:rFonts w:ascii="Cambria Math" w:hAnsi="Cambria Math"/>
+                          <w:i/>
+                          <w:sz w:val="24"/>
+                          <w:szCs w:val="24"/>
+                          <w:lang w:val="en-US"/>
+                        </w:rPr>
+                      </m:ctrlPr>
+                    </m:dPr>
+                    <m:e>
+                      <m:r>
+                        <w:rPr>
+                          <w:rFonts w:ascii="Cambria Math" w:hAnsi="Cambria Math"/>
+                          <w:sz w:val="24"/>
+                          <w:szCs w:val="24"/>
+                          <w:lang w:val="en-US"/>
+                        </w:rPr>
+                        <m:t>s,a</m:t>
+                      </m:r>
+                    </m:e>
+                  </m:d>
+                </m:e>
+              </m:d>
             </m:e>
-            <m:lim>
-              <m:r>
-                <w:rPr>
-                  <w:rFonts w:ascii="Cambria Math" w:hAnsi="Cambria Math"/>
-                  <w:sz w:val="24"/>
-                  <w:szCs w:val="24"/>
-                  <w:lang w:val="en-US"/>
-                </w:rPr>
-                <m:t>π∈</m:t>
-              </m:r>
-              <m:r>
-                <m:rPr>
-                  <m:sty m:val="p"/>
-                </m:rPr>
-                <w:rPr>
-                  <w:rFonts w:ascii="Cambria Math" w:hAnsi="Cambria Math"/>
-                  <w:sz w:val="24"/>
-                  <w:szCs w:val="24"/>
-                  <w:lang w:val="en-US"/>
-                </w:rPr>
-                <m:t>Π</m:t>
-              </m:r>
-            </m:lim>
-          </m:limLow>
-          <m:r>
-            <m:rPr>
-              <m:scr m:val="double-struck"/>
-              <m:sty m:val="p"/>
-            </m:rPr>
-            <w:rPr>
-              <w:rFonts w:ascii="Cambria Math" w:hAnsi="Cambria Math"/>
-              <w:sz w:val="24"/>
-              <w:szCs w:val="24"/>
-              <w:lang w:val="en-US"/>
-            </w:rPr>
-            <m:t>E</m:t>
-          </m:r>
-          <m:r>
-            <w:rPr>
-              <w:rFonts w:ascii="Cambria Math" w:hAnsi="Cambria Math"/>
-              <w:sz w:val="24"/>
-              <w:szCs w:val="24"/>
-              <w:lang w:val="en-US"/>
-            </w:rPr>
-            <m:t>[L(s,a)]</m:t>
-          </m:r>
+          </m:func>
           <m:r>
             <m:rPr>
               <m:nor/>
@@ -402,8 +443,10 @@
             <m:t>a)=1</m:t>
           </m:r>
           <m:r>
-            <w:rPr>
-              <w:i/>
+            <m:rPr>
+              <m:sty m:val="p"/>
+            </m:rPr>
+            <w:rPr>
               <w:lang w:val="en-US"/>
             </w:rPr>
             <w:br/>
@@ -780,8 +823,10 @@
             <m:t>(A)</m:t>
           </m:r>
           <m:r>
-            <w:rPr>
-              <w:i/>
+            <m:rPr>
+              <m:sty m:val="p"/>
+            </m:rPr>
+            <w:rPr>
               <w:lang w:val="en-US"/>
             </w:rPr>
             <w:br/>
@@ -1243,8 +1288,10 @@
             <m:t>)</m:t>
           </m:r>
           <m:r>
-            <w:rPr>
-              <w:i/>
+            <m:rPr>
+              <m:sty m:val="p"/>
+            </m:rPr>
+            <w:rPr>
               <w:lang w:val="en-US"/>
             </w:rPr>
             <w:br/>
@@ -1407,6 +1454,9 @@
             <m:t xml:space="preserve"> is measurable</m:t>
           </m:r>
           <m:r>
+            <m:rPr>
+              <m:sty m:val="p"/>
+            </m:rPr>
             <w:rPr>
               <w:lang w:val="en-US"/>
             </w:rPr>
@@ -1478,6 +1528,14 @@
       </m:oMath>
       <w:r>
         <w:rPr>
+          <w:sz w:val="24"/>
+          <w:szCs w:val="24"/>
+          <w:lang w:val="en-US"/>
+        </w:rPr>
+        <w:t xml:space="preserve"> </w:t>
+      </w:r>
+      <w:r>
+        <w:rPr>
           <w:lang w:val="en-US"/>
         </w:rPr>
         <w:t xml:space="preserve">is system state at time </w:t>
@@ -1549,6 +1607,14 @@
       </m:oMath>
       <w:r>
         <w:rPr>
+          <w:sz w:val="24"/>
+          <w:szCs w:val="24"/>
+          <w:lang w:val="en-US"/>
+        </w:rPr>
+        <w:t xml:space="preserve"> </w:t>
+      </w:r>
+      <w:r>
+        <w:rPr>
           <w:lang w:val="en-US"/>
         </w:rPr>
         <w:t>is the selected action.</w:t>
@@ -1603,6 +1669,14 @@
       </m:oMath>
       <w:r>
         <w:rPr>
+          <w:sz w:val="24"/>
+          <w:szCs w:val="24"/>
+          <w:lang w:val="en-US"/>
+        </w:rPr>
+        <w:t xml:space="preserve"> </w:t>
+      </w:r>
+      <w:r>
+        <w:rPr>
           <w:lang w:val="en-US"/>
         </w:rPr>
         <w:t>represents environmental uncertainty.</w:t>
@@ -1841,8 +1915,10 @@
             <m:t>)</m:t>
           </m:r>
           <m:r>
-            <w:rPr>
-              <w:i/>
+            <m:rPr>
+              <m:sty m:val="p"/>
+            </m:rPr>
+            <w:rPr>
               <w:lang w:val="en-US"/>
             </w:rPr>
             <w:br/>
@@ -2374,8 +2450,10 @@
             <m:t>(s)</m:t>
           </m:r>
           <m:r>
-            <w:rPr>
-              <w:i/>
+            <m:rPr>
+              <m:sty m:val="p"/>
+            </m:rPr>
+            <w:rPr>
               <w:lang w:val="en-US"/>
             </w:rPr>
             <w:br/>
@@ -2480,7 +2558,7 @@
         <w:rPr>
           <w:lang w:val="en-US"/>
         </w:rPr>
-        <w:t>constraints reflects classical dynamic programming and sequential decision-making</w:t>
+        <w:t>constraint reflects classical dynamic programming and sequential decision-making</w:t>
       </w:r>
       <w:r>
         <w:rPr>
@@ -2743,7 +2821,13 @@
         <w:t>the historical trajectory of cybersecurity</w:t>
       </w:r>
       <w:r>
-        <w:t xml:space="preserve"> mirrors the philosophical development of artificial intelligence. In the 1990s, defensive automation consisted of rule-based intrusion detection systems that matched byte signatures and issued alerts</w:t>
+        <w:t xml:space="preserve"> mirrors the </w:t>
+      </w:r>
+      <w:r>
+        <w:t>conceptual</w:t>
+      </w:r>
+      <w:r>
+        <w:t xml:space="preserve"> development of artificial intelligence. In the 1990s, defensive automation consisted of rule-based intrusion detection systems that matched byte signatures and issued alerts</w:t>
       </w:r>
       <w:sdt>
         <w:sdtPr>
@@ -3636,10 +3720,13 @@
         </w:sdtContent>
       </w:sdt>
       <w:r>
+        <w:t>.</w:t>
+      </w:r>
+      <w:r>
         <w:t xml:space="preserve"> </w:t>
       </w:r>
       <w:r>
-        <w:t>In this book, "agentic" refers to systems capable of goal-directed decision-making under constraint, while multi-agent architectures represent one implementation pattern for distributing such decision capacity across coordinated entities.</w:t>
+        <w:t>In this book, "agentic" refers to systems capable of goal-directed decision-making under constraint, while multi-agent architectures represent one implementation pattern for distributing such decision capacity across coordinated entities</w:t>
       </w:r>
       <w:r>
         <w:t>.</w:t>
@@ -4413,7 +4500,7 @@
         <w:t xml:space="preserve">: </w:t>
       </w:r>
       <w:r>
-        <w:t>Such properties hint at the emergence of synthetic collaboration: defense ecosystems that co-evolve operational knowledge and executable logic</w:t>
+        <w:t>defense ecosystems that co-evolve operational knowledge and executable logic</w:t>
       </w:r>
       <w:r>
         <w:t>.</w:t>
@@ -6668,6 +6755,9 @@
         <w:t> </w:t>
       </w:r>
       <w:r>
+        <w:t xml:space="preserve">the </w:t>
+      </w:r>
+      <w:r>
         <w:rPr>
           <w:b/>
           <w:bCs/>
@@ -7173,7 +7263,7 @@
         <w:t xml:space="preserve">reinforcement adaptation will yield </w:t>
       </w:r>
       <w:r>
-        <w:t>yield self-governing security ecosystems</w:t>
+        <w:t>self-governing security ecosystems</w:t>
       </w:r>
       <w:r>
         <w:t>,</w:t>
@@ -7203,10 +7293,13 @@
         <w:t>whether these entities defend humanity for us or</w:t>
       </w:r>
       <w:r>
-        <w:t>, eventually, against</w:t>
-      </w:r>
-      <w:r>
-        <w:t xml:space="preserve"> us.</w:t>
+        <w:t xml:space="preserve">, eventually, </w:t>
+      </w:r>
+      <w:r>
+        <w:t>in ways misaligned with human intent</w:t>
+      </w:r>
+      <w:r>
+        <w:t>.</w:t>
       </w:r>
     </w:p>
     <w:p/>
@@ -7222,27 +7315,22 @@
     </w:p>
     <w:sdt>
       <w:sdtPr>
+        <w:rPr>
+          <w:b w:val="0"/>
+          <w:sz w:val="20"/>
+          <w:szCs w:val="20"/>
+        </w:rPr>
         <w:id w:val="-1993784926"/>
         <w:docPartObj>
           <w:docPartGallery w:val="Bibliographies"/>
           <w:docPartUnique/>
         </w:docPartObj>
       </w:sdtPr>
-      <w:sdtEndPr>
-        <w:rPr>
-          <w:b w:val="0"/>
-          <w:sz w:val="20"/>
-          <w:szCs w:val="20"/>
-        </w:rPr>
-      </w:sdtEndPr>
       <w:sdtContent>
         <w:p>
           <w:pPr>
             <w:pStyle w:val="Secondaryheadings"/>
           </w:pPr>
-          <w:r>
-            <w:t>,</w:t>
-          </w:r>
           <w:r>
             <w:t>References</w:t>
           </w:r>
@@ -7275,7 +7363,13 @@
                 <w:rPr>
                   <w:noProof/>
                 </w:rPr>
-                <w:t xml:space="preserve">Astrum, Karl J., and Richard M. Murray. 2008. </w:t>
+                <w:t>Åström</w:t>
+              </w:r>
+              <w:r>
+                <w:rPr>
+                  <w:noProof/>
+                </w:rPr>
+                <w:t xml:space="preserve">, Karl J., and Richard M. Murray. 2008. </w:t>
               </w:r>
               <w:r>
                 <w:rPr>
@@ -7303,7 +7397,19 @@
                 <w:rPr>
                   <w:noProof/>
                 </w:rPr>
-                <w:t xml:space="preserve">Bayes, Thomas. 1763. "An essay towards solving a problem in the doctrine of chances." </w:t>
+                <w:t>Bayes, Thomas. 1</w:t>
+              </w:r>
+              <w:r>
+                <w:rPr>
+                  <w:noProof/>
+                </w:rPr>
+                <w:t>9</w:t>
+              </w:r>
+              <w:r>
+                <w:rPr>
+                  <w:noProof/>
+                </w:rPr>
+                <w:t xml:space="preserve">63. "An essay towards solving a problem in the doctrine of chances." </w:t>
               </w:r>
               <w:r>
                 <w:rPr>
@@ -7387,7 +7493,31 @@
                 <w:rPr>
                   <w:noProof/>
                 </w:rPr>
-                <w:t xml:space="preserve">Borgeaud, Sebastian, Arthur Mensch, Jordan Hoffmann, Trevor Cai, Eliza Rutherford, Katie Millican, George van den Driessche, et al. 2021. “Improving Language Models by Retrieving from Trillions of Tokens.” </w:t>
+                <w:t xml:space="preserve">Borgeaud, Sebastian, Arthur Mensch, Jordan Hoffmann, Trevor Cai, Eliza Rutherford, Katie Millican, George van den Driessche, et al. 2021. </w:t>
+              </w:r>
+              <w:r>
+                <w:rPr>
+                  <w:noProof/>
+                </w:rPr>
+                <w:t>"</w:t>
+              </w:r>
+              <w:r>
+                <w:rPr>
+                  <w:noProof/>
+                </w:rPr>
+                <w:t>Improving Language Models by Retrieving from Trillions of Tokens.</w:t>
+              </w:r>
+              <w:r>
+                <w:rPr>
+                  <w:noProof/>
+                </w:rPr>
+                <w:t>"</w:t>
+              </w:r>
+              <w:r>
+                <w:rPr>
+                  <w:noProof/>
+                </w:rPr>
+                <w:t xml:space="preserve"> </w:t>
               </w:r>
               <w:r>
                 <w:rPr>
@@ -7415,7 +7545,31 @@
                 <w:rPr>
                   <w:noProof/>
                 </w:rPr>
-                <w:t xml:space="preserve">CrewAI. 2025. “CrewAI: Multi-Agent Collaboration Framework.” </w:t>
+                <w:t xml:space="preserve">CrewAI. 2025. </w:t>
+              </w:r>
+              <w:r>
+                <w:rPr>
+                  <w:noProof/>
+                </w:rPr>
+                <w:t>"</w:t>
+              </w:r>
+              <w:r>
+                <w:rPr>
+                  <w:noProof/>
+                </w:rPr>
+                <w:t>CrewAI: Multi-Agent Collaboration Framework.</w:t>
+              </w:r>
+              <w:r>
+                <w:rPr>
+                  <w:noProof/>
+                </w:rPr>
+                <w:t>"</w:t>
+              </w:r>
+              <w:r>
+                <w:rPr>
+                  <w:noProof/>
+                </w:rPr>
+                <w:t xml:space="preserve"> </w:t>
               </w:r>
               <w:r>
                 <w:rPr>
@@ -7443,7 +7597,31 @@
                 <w:rPr>
                   <w:noProof/>
                 </w:rPr>
-                <w:t xml:space="preserve">European Union. 2024. “Artificial Intelligence Act.” </w:t>
+                <w:t xml:space="preserve">European Union. 2024. </w:t>
+              </w:r>
+              <w:r>
+                <w:rPr>
+                  <w:noProof/>
+                </w:rPr>
+                <w:t>"</w:t>
+              </w:r>
+              <w:r>
+                <w:rPr>
+                  <w:noProof/>
+                </w:rPr>
+                <w:t>Artificial Intelligence Act.</w:t>
+              </w:r>
+              <w:r>
+                <w:rPr>
+                  <w:noProof/>
+                </w:rPr>
+                <w:t>"</w:t>
+              </w:r>
+              <w:r>
+                <w:rPr>
+                  <w:noProof/>
+                </w:rPr>
+                <w:t xml:space="preserve"> </w:t>
               </w:r>
               <w:r>
                 <w:rPr>
@@ -7471,7 +7649,31 @@
                 <w:rPr>
                   <w:noProof/>
                 </w:rPr>
-                <w:t xml:space="preserve">Floridi, Luciano, and Josh Cowls. 2019. “A Unified Framework of Five Principles for AI in Society.” </w:t>
+                <w:t xml:space="preserve">Floridi, Luciano, and Josh Cowls. 2019. </w:t>
+              </w:r>
+              <w:r>
+                <w:rPr>
+                  <w:noProof/>
+                </w:rPr>
+                <w:t>"</w:t>
+              </w:r>
+              <w:r>
+                <w:rPr>
+                  <w:noProof/>
+                </w:rPr>
+                <w:t>A Unified Framework of Five Principles for AI in Society.</w:t>
+              </w:r>
+              <w:r>
+                <w:rPr>
+                  <w:noProof/>
+                </w:rPr>
+                <w:t>"</w:t>
+              </w:r>
+              <w:r>
+                <w:rPr>
+                  <w:noProof/>
+                </w:rPr>
+                <w:t xml:space="preserve"> </w:t>
               </w:r>
               <w:r>
                 <w:rPr>
@@ -7499,7 +7701,19 @@
                 <w:rPr>
                   <w:noProof/>
                 </w:rPr>
-                <w:t xml:space="preserve">Goodfellow, Ian, Yoshua. Bengio and Aaron. Courville. 2017. </w:t>
+                <w:t>Goodfellow, Ian, Yoshua. Bengio and Aaron. Courville. 201</w:t>
+              </w:r>
+              <w:r>
+                <w:rPr>
+                  <w:noProof/>
+                </w:rPr>
+                <w:t>6</w:t>
+              </w:r>
+              <w:r>
+                <w:rPr>
+                  <w:noProof/>
+                </w:rPr>
+                <w:t xml:space="preserve">. </w:t>
               </w:r>
               <w:r>
                 <w:rPr>
@@ -7527,7 +7741,31 @@
                 <w:rPr>
                   <w:noProof/>
                 </w:rPr>
-                <w:t xml:space="preserve">Ho, Jonathan, Ajay Jain, and Pieter Abbeel. 2020. “Denoising Diffusion Probabilistic Models.” </w:t>
+                <w:t xml:space="preserve">Ho, Jonathan, Ajay Jain, and Pieter Abbeel. 2020. </w:t>
+              </w:r>
+              <w:r>
+                <w:rPr>
+                  <w:noProof/>
+                </w:rPr>
+                <w:t>"</w:t>
+              </w:r>
+              <w:r>
+                <w:rPr>
+                  <w:noProof/>
+                </w:rPr>
+                <w:t>Denoising Diffusion Probabilistic Models.</w:t>
+              </w:r>
+              <w:r>
+                <w:rPr>
+                  <w:noProof/>
+                </w:rPr>
+                <w:t>"</w:t>
+              </w:r>
+              <w:r>
+                <w:rPr>
+                  <w:noProof/>
+                </w:rPr>
+                <w:t xml:space="preserve"> </w:t>
               </w:r>
               <w:r>
                 <w:rPr>
@@ -7555,7 +7793,31 @@
                 <w:rPr>
                   <w:noProof/>
                 </w:rPr>
-                <w:t xml:space="preserve">Kaelbling, Leslie Pack, Michael L. Littman, and Anthony R. Cassandra. 1998. “Planning and acting in partially observable stochastic domains.” </w:t>
+                <w:t xml:space="preserve">Kaelbling, Leslie Pack, Michael L. Littman, and Anthony R. Cassandra. 1998. </w:t>
+              </w:r>
+              <w:r>
+                <w:rPr>
+                  <w:noProof/>
+                </w:rPr>
+                <w:t>"</w:t>
+              </w:r>
+              <w:r>
+                <w:rPr>
+                  <w:noProof/>
+                </w:rPr>
+                <w:t>Planning and acting in partially observable stochastic domains.</w:t>
+              </w:r>
+              <w:r>
+                <w:rPr>
+                  <w:noProof/>
+                </w:rPr>
+                <w:t>"</w:t>
+              </w:r>
+              <w:r>
+                <w:rPr>
+                  <w:noProof/>
+                </w:rPr>
+                <w:t xml:space="preserve"> </w:t>
               </w:r>
               <w:r>
                 <w:rPr>
@@ -7583,7 +7845,31 @@
                 <w:rPr>
                   <w:noProof/>
                 </w:rPr>
-                <w:t xml:space="preserve">Kalman, Rudolf E. 1960. “A New Approach to Linear Filtering and Prediction Problems.” </w:t>
+                <w:t xml:space="preserve">Kalman, Rudolf E. 1960. </w:t>
+              </w:r>
+              <w:r>
+                <w:rPr>
+                  <w:noProof/>
+                </w:rPr>
+                <w:t>"</w:t>
+              </w:r>
+              <w:r>
+                <w:rPr>
+                  <w:noProof/>
+                </w:rPr>
+                <w:t>A New Approach to Linear Filtering and Prediction Problems.</w:t>
+              </w:r>
+              <w:r>
+                <w:rPr>
+                  <w:noProof/>
+                </w:rPr>
+                <w:t>"</w:t>
+              </w:r>
+              <w:r>
+                <w:rPr>
+                  <w:noProof/>
+                </w:rPr>
+                <w:t xml:space="preserve"> </w:t>
               </w:r>
               <w:r>
                 <w:rPr>
@@ -7611,7 +7897,25 @@
                 <w:rPr>
                   <w:noProof/>
                 </w:rPr>
-                <w:t xml:space="preserve">Kolmogorov, Andrey N. 1933. </w:t>
+                <w:t>Kolmogorov, Andrey N. 19</w:t>
+              </w:r>
+              <w:r>
+                <w:rPr>
+                  <w:noProof/>
+                </w:rPr>
+                <w:t>50</w:t>
+              </w:r>
+              <w:r>
+                <w:rPr>
+                  <w:noProof/>
+                </w:rPr>
+                <w:t>As</w:t>
+              </w:r>
+              <w:r>
+                <w:rPr>
+                  <w:noProof/>
+                </w:rPr>
+                <w:t xml:space="preserve">. </w:t>
               </w:r>
               <w:r>
                 <w:rPr>
@@ -7639,7 +7943,31 @@
                 <w:rPr>
                   <w:noProof/>
                 </w:rPr>
-                <w:t>LangChain. 2024. “LangChain Documentation: Multi-Agent Systems.” https://docs.langchain.com.</w:t>
+                <w:t xml:space="preserve">LangChain. 2024. </w:t>
+              </w:r>
+              <w:r>
+                <w:rPr>
+                  <w:noProof/>
+                </w:rPr>
+                <w:t>"</w:t>
+              </w:r>
+              <w:r>
+                <w:rPr>
+                  <w:noProof/>
+                </w:rPr>
+                <w:t>LangChain Documentation: Multi-Agent Systems.</w:t>
+              </w:r>
+              <w:r>
+                <w:rPr>
+                  <w:noProof/>
+                </w:rPr>
+                <w:t>"</w:t>
+              </w:r>
+              <w:r>
+                <w:rPr>
+                  <w:noProof/>
+                </w:rPr>
+                <w:t xml:space="preserve"> https://docs.langchain.com.</w:t>
               </w:r>
             </w:p>
             <w:p>
@@ -7653,7 +7981,31 @@
                 <w:rPr>
                   <w:noProof/>
                 </w:rPr>
-                <w:t xml:space="preserve">Leocadio, Paulo H. 2025. “The Role of Hugging Face Diffusers in Automating Cybersecurity Workflows.” </w:t>
+                <w:t xml:space="preserve">Leocadio, Paulo H. 2025. </w:t>
+              </w:r>
+              <w:r>
+                <w:rPr>
+                  <w:noProof/>
+                </w:rPr>
+                <w:t>"</w:t>
+              </w:r>
+              <w:r>
+                <w:rPr>
+                  <w:noProof/>
+                </w:rPr>
+                <w:t>The Role of Hugging Face Diffusers in Automating Cybersecurity Workflows.</w:t>
+              </w:r>
+              <w:r>
+                <w:rPr>
+                  <w:noProof/>
+                </w:rPr>
+                <w:t>"</w:t>
+              </w:r>
+              <w:r>
+                <w:rPr>
+                  <w:noProof/>
+                </w:rPr>
+                <w:t xml:space="preserve"> </w:t>
               </w:r>
               <w:r>
                 <w:rPr>
@@ -7709,7 +8061,19 @@
                 <w:rPr>
                   <w:noProof/>
                 </w:rPr>
-                <w:t xml:space="preserve">NIST. 2023. “Artificial Intelligence Risk Management Framework (NIST AI 100-1).” In the </w:t>
+                <w:t>NIST. 2023. “Artificial Intelligence Risk Management Framework (NIST AI 100-1).</w:t>
+              </w:r>
+              <w:r>
+                <w:rPr>
+                  <w:noProof/>
+                </w:rPr>
+                <w:t>"</w:t>
+              </w:r>
+              <w:r>
+                <w:rPr>
+                  <w:noProof/>
+                </w:rPr>
+                <w:t xml:space="preserve"> In the </w:t>
               </w:r>
               <w:r>
                 <w:rPr>
@@ -7737,7 +8101,31 @@
                 <w:rPr>
                   <w:noProof/>
                 </w:rPr>
-                <w:t>OpenAI, Josh Achiam, Steven Adler, Sandhini Agarwal, Lama Ahmad, Ilge Akkaya, Florencia Leoni Aleman, et al. 2024. “GPT-4 Technical Report.” http://arxiv.org/abs/2303.08774.</w:t>
+                <w:t>OpenAI, Josh Achiam, Steven Adler, Sandhini Agarwal, Lama Ahmad, Ilge Akkaya, Florencia Leoni Aleman, et al. 202</w:t>
+              </w:r>
+              <w:r>
+                <w:rPr>
+                  <w:noProof/>
+                </w:rPr>
+                <w:t>4</w:t>
+              </w:r>
+              <w:r>
+                <w:rPr>
+                  <w:noProof/>
+                </w:rPr>
+                <w:t>. “GPT-4 Technical Report.</w:t>
+              </w:r>
+              <w:r>
+                <w:rPr>
+                  <w:noProof/>
+                </w:rPr>
+                <w:t>"</w:t>
+              </w:r>
+              <w:r>
+                <w:rPr>
+                  <w:noProof/>
+                </w:rPr>
+                <w:t xml:space="preserve"> http://arxiv.org/abs/2303.08774.</w:t>
               </w:r>
             </w:p>
             <w:p>
@@ -7751,7 +8139,31 @@
                 <w:rPr>
                   <w:noProof/>
                 </w:rPr>
-                <w:t xml:space="preserve">Rahwan, Iyad. 2019. “Machine Behaviour.” </w:t>
+                <w:t xml:space="preserve">Rahwan, Iyad. 2019. </w:t>
+              </w:r>
+              <w:r>
+                <w:rPr>
+                  <w:noProof/>
+                </w:rPr>
+                <w:t>"</w:t>
+              </w:r>
+              <w:r>
+                <w:rPr>
+                  <w:noProof/>
+                </w:rPr>
+                <w:t>Machine Behaviour.</w:t>
+              </w:r>
+              <w:r>
+                <w:rPr>
+                  <w:noProof/>
+                </w:rPr>
+                <w:t>"</w:t>
+              </w:r>
+              <w:r>
+                <w:rPr>
+                  <w:noProof/>
+                </w:rPr>
+                <w:t xml:space="preserve"> </w:t>
               </w:r>
               <w:r>
                 <w:rPr>
@@ -7807,7 +8219,31 @@
                 <w:rPr>
                   <w:noProof/>
                 </w:rPr>
-                <w:t xml:space="preserve">Smethurst, Dr. Rebecca. 2025. “Lecture on AI Governance and Trust.” In </w:t>
+                <w:t xml:space="preserve">Smethurst, Dr. Rebecca. 2025. </w:t>
+              </w:r>
+              <w:r>
+                <w:rPr>
+                  <w:noProof/>
+                </w:rPr>
+                <w:t>"</w:t>
+              </w:r>
+              <w:r>
+                <w:rPr>
+                  <w:noProof/>
+                </w:rPr>
+                <w:t>Lecture on AI Governance and Trust.</w:t>
+              </w:r>
+              <w:r>
+                <w:rPr>
+                  <w:noProof/>
+                </w:rPr>
+                <w:t>"</w:t>
+              </w:r>
+              <w:r>
+                <w:rPr>
+                  <w:noProof/>
+                </w:rPr>
+                <w:t xml:space="preserve"> In </w:t>
               </w:r>
               <w:r>
                 <w:rPr>
@@ -7891,19 +8327,67 @@
                 <w:rPr>
                   <w:noProof/>
                 </w:rPr>
-                <w:t xml:space="preserve">Vaswani, Ashish, Noam Shazeer, Niki Parmar, Jakob Uszkoreit, Llion Jones, Aidan N. Gomez, Lukasz Kaiser, </w:t>
-              </w:r>
-              <w:r>
-                <w:rPr>
-                  <w:noProof/>
-                </w:rPr>
-                <w:t>und</w:t>
-              </w:r>
-              <w:r>
-                <w:rPr>
-                  <w:noProof/>
-                </w:rPr>
-                <w:t xml:space="preserve"> Illia Polosukhin. 2023. “Attention Is All You Need.” </w:t>
+                <w:t xml:space="preserve">Vaswani, Ashish, Noam Shazeer, Niki Parmar, Jakob Uszkoreit, Llion Jones, Aidan N. Gomez, Lukasz Kaiser </w:t>
+              </w:r>
+              <w:r>
+                <w:rPr>
+                  <w:noProof/>
+                </w:rPr>
+                <w:t>a</w:t>
+              </w:r>
+              <w:r>
+                <w:rPr>
+                  <w:noProof/>
+                </w:rPr>
+                <w:t>nd</w:t>
+              </w:r>
+              <w:r>
+                <w:rPr>
+                  <w:noProof/>
+                </w:rPr>
+                <w:t xml:space="preserve"> Illia Polosukhin. 20</w:t>
+              </w:r>
+              <w:r>
+                <w:rPr>
+                  <w:noProof/>
+                </w:rPr>
+                <w:t>1</w:t>
+              </w:r>
+              <w:r>
+                <w:rPr>
+                  <w:noProof/>
+                </w:rPr>
+                <w:t>7</w:t>
+              </w:r>
+              <w:r>
+                <w:rPr>
+                  <w:noProof/>
+                </w:rPr>
+                <w:t xml:space="preserve">. </w:t>
+              </w:r>
+              <w:r>
+                <w:rPr>
+                  <w:noProof/>
+                </w:rPr>
+                <w:t>"</w:t>
+              </w:r>
+              <w:r>
+                <w:rPr>
+                  <w:noProof/>
+                </w:rPr>
+                <w:t>Attention Is All You Need.</w:t>
+              </w:r>
+              <w:r>
+                <w:rPr>
+                  <w:noProof/>
+                </w:rPr>
+                <w:t>"</w:t>
+              </w:r>
+              <w:r>
+                <w:rPr>
+                  <w:noProof/>
+                </w:rPr>
+                <w:t xml:space="preserve"> </w:t>
               </w:r>
               <w:r>
                 <w:rPr>
@@ -8257,7 +8741,10 @@
         <w:footnoteRef/>
       </w:r>
       <w:r>
-        <w:t xml:space="preserve"> S</w:t>
+        <w:t xml:space="preserve"> </w:t>
+      </w:r>
+      <w:r>
+        <w:t>A</w:t>
       </w:r>
       <w:r>
         <w:rPr>

</xml_diff>